<commit_message>
TZ inflace: aktuální objem majetku z portu.cz a formát pozice v podpisu
- nastroje/portu-aum.js načte údaj „… miliard Kč zainvestováno“ z portu.cz
- tz-inflace-do-wordu.py: parametr --aum, „Financial Markets Analyst“ fialově bez tučného
- TZ za září 2026 přegenerována (76 miliard Kč)

Co-Authored-By: Claude Opus 5.5 <noreply@anthropic.com>
Claude-Session: https://claude.ai/code/session_01BAuZH7QZG4PCCCSGbbRobY
</commit_message>
<xml_diff>
--- a/vystupy/tiskove-zpravy-inflace/2026-09-TZ-inflace.docx
+++ b/vystupy/tiskove-zpravy-inflace/2026-09-TZ-inflace.docx
@@ -740,12 +740,9 @@
             <w:r>
               <w:rPr>
                 <w:rFonts w:eastAsiaTheme="minorEastAsia"/>
-                <w:b/>
-                <w:bCs/>
                 <w:noProof/>
-                <w:color w:val="000000"/>
-                <w:sz w:val="16"/>
-                <w:szCs w:val="16"/>
+                <w:color w:val="9646AA"/>
+                <w:szCs w:val="18"/>
                 <w:lang w:val="cs-CZ" w:eastAsia="cs-CZ"/>
               </w:rPr>
               <w:t>Financial Markets Analyst</w:t>
@@ -944,7 +941,7 @@
           <w:sz w:val="16"/>
           <w:szCs w:val="16"/>
         </w:rPr>
-        <w:t xml:space="preserve"> tisíc klientů a pod správou má přes </w:t>
+        <w:t xml:space="preserve"> tisíc klientů a pod správou má 76 miliard Kč</w:t>
       </w:r>
       <w:r>
         <w:rPr>
@@ -952,7 +949,7 @@
           <w:sz w:val="16"/>
           <w:szCs w:val="16"/>
         </w:rPr>
-        <w:t>7</w:t>
+        <w:t xml:space="preserve"/>
       </w:r>
       <w:r>
         <w:rPr>
@@ -960,7 +957,7 @@
           <w:sz w:val="16"/>
           <w:szCs w:val="16"/>
         </w:rPr>
-        <w:t>0</w:t>
+        <w:t xml:space="preserve"/>
       </w:r>
       <w:r>
         <w:rPr>
@@ -968,7 +965,7 @@
           <w:sz w:val="16"/>
           <w:szCs w:val="16"/>
         </w:rPr>
-        <w:t xml:space="preserve"> miliard Kč. Investiční platforma Portu vznikla v roce 2017 v investiční skupině WOOD &amp; Company, j</w:t>
+        <w:t xml:space="preserve">. Investiční platforma Portu vznikla v roce 2017 v investiční skupině WOOD &amp; Company, j</w:t>
       </w:r>
       <w:r>
         <w:rPr>

</xml_diff>

<commit_message>
TZ inflace: hlas autora místo přepisu prohlášení centrálních bank
- prompt: nová kapitola 4a (fakta a hodnocení jako vlastní tvrzení, původce jen u rozhodnutí, plánů, prognóz a výroků), úprava pravidel 2.4, 4 a kontroly
- TZ za září 2026 přepsána v tomto stylu (ČNB, ECB, Fed)

Co-Authored-By: Claude Opus 5.5 <noreply@anthropic.com>
Claude-Session: https://claude.ai/code/session_01BAuZH7QZG4PCCCSGbbRobY
</commit_message>
<xml_diff>
--- a/vystupy/tiskove-zpravy-inflace/2026-09-TZ-inflace.docx
+++ b/vystupy/tiskove-zpravy-inflace/2026-09-TZ-inflace.docx
@@ -228,7 +228,7 @@
         <w:rPr>
           <w:lang w:val="cs-CZ"/>
         </w:rPr>
-        <w:t xml:space="preserve">Česká národní banka na zářijovém zasedání jednomyslně ponechala dvoutýdenní repo sazbu na 3,75 %, a to podruhé v řadě. Inflace se sice v srpnu držela pod cílem ČNB na úrovni 1,9 %, zvýšený výhled inflace na rok 2027 však podle centrální banky vyžaduje zvýšenou opatrnost v měnové politice. Mezi zdroje inflačních tlaků ČNB řadí odolnou domácí poptávku, silný růst mezd, rychlý růst úvěrů a expanzivní fiskální politiku. Guvernér Aleš Michl uvedl, že bankovní rada bude na listopadovém zasedání pravděpodobně zvažovat ponechání sazeb beze změny, nebo jejich zvýšení.</w:t>
+        <w:t xml:space="preserve">Česká národní banka na zářijovém zasedání jednomyslně ponechala dvoutýdenní repo sazbu na 3,75 %, a to podruhé v řadě. Inflace se sice v srpnu držela pod cílem ČNB na úrovni 1,9 %, výhled na rok 2027 je ale zvýšený a vyžaduje v měnové politice opatrnost. Inflační tlaky v české ekonomice přitom nezmizely. Živí je odolná domácí poptávka, silný růst mezd, rychlý růst úvěrů i expanzivní fiskální politika. Guvernér Aleš Michl uvedl, že bankovní rada bude na listopadovém zasedání pravděpodobně zvažovat ponechání sazeb beze změny, nebo jejich zvýšení.</w:t>
       </w:r>
     </w:p>
     <w:p>
@@ -345,7 +345,7 @@
         <w:rPr>
           <w:lang w:val="cs-CZ"/>
         </w:rPr>
-        <w:t xml:space="preserve"> na zářijovém zasedání zvýšila klíčové úrokové sazby o 25 bazických bodů, což bylo druhé zvýšení od začátku války mezi USA a Íránem. Hlavní refinanční sazba vzrostla na 2,65 % a depozitní sazba na 2,5 %. Podle ECB konflikt na Blízkém východě nadále přiživuje inflační tlaky a inflace má zůstat výrazně nad dvouprocentním cílem po delší dobu. Banka ponechala odhad inflace pro rok 2026 na 3,0 %, pro roky 2027 a 2028 ho však zvýšila na 2,5 %, respektive 2,1 %.</w:t>
+        <w:t xml:space="preserve"> na zářijovém zasedání zvýšila klíčové úrokové sazby o 25 bazických bodů, což bylo druhé zvýšení od začátku války mezi USA a Íránem. Hlavní refinanční sazba vzrostla na 2,65 % a depozitní sazba na 2,5 %. Konflikt na Blízkém východě nadále přiživuje inflační tlaky a inflace v eurozóně tak zřejmě zůstane výrazně nad dvouprocentním cílem ještě delší dobu. ECB ponechala odhad inflace pro rok 2026 na 3,0 %, pro roky 2027 a 2028 ho však zvýšila na 2,5 %, respektive 2,1 %.</w:t>
       </w:r>
     </w:p>
     <w:p>
@@ -359,7 +359,7 @@
         <w:rPr>
           <w:lang w:val="cs-CZ"/>
         </w:rPr>
-        <w:t xml:space="preserve">Podle zápisu ze zářijového zasedání vidí představitelé ECB rizika pro inflaci vychýlená směrem nahoru. Zároveň zdůraznili, že nechtějí naznačovat další kroky a ponechávají si otevřené všechny možnosti. Kvůli vysoké nejistotě, kterou přinášejí pokračující boje mezi USA a Íránem i válka Ruska na Ukrajině, se chtějí vyhnout vodítkům o budoucím vývoji sazeb. Depozitní sazba ve výši 2,50 % se podle ECB stále nachází v pásmu odhadů neutrální sazby. Další zasedání ECB je naplánováno na 29. října 2026.</w:t>
+        <w:t xml:space="preserve">Rizika pro inflaci v eurozóně zůstávají vychýlená směrem nahoru. ECB si přesto nechává otevřené všechny možnosti a další kroky dopředu nenaznačuje. Nejistota je totiž vysoká, ať už kvůli pokračujícím bojům mezi USA a Íránem, nebo kvůli válce Ruska na Ukrajině. Depozitní sazba ve výši 2,50 % se přitom stále nachází v pásmu, které ekonomové ECB odhadují jako neutrální. Další zasedání ECB je naplánováno na 29. října 2026.</w:t>
       </w:r>
     </w:p>
     <w:p>
@@ -417,7 +417,7 @@
         <w:rPr>
           <w:lang w:val="cs-CZ"/>
         </w:rPr>
-        <w:t xml:space="preserve"> na zářijovém zasedání jednomyslně zvýšil cílové pásmo pro sazbu federálních fondů o 25 bazických bodů na 3,75 až 4,00 %, což bylo první zvýšení od roku 2023. Podle centrální banky zůstává inflace zvýšená a krok má podpořit rychlejší návrat k dvouprocentnímu cíli. Aktualizované projekce ukázaly, že 16 z 18 představitelů Fedu počítá s možností alespoň jednoho dalšího zvýšení o 25 bazických bodů do konce roku a čtyři z nich se dvěma.</w:t>
+        <w:t xml:space="preserve"> na zářijovém zasedání jednomyslně zvýšil cílové pásmo pro sazbu federálních fondů o 25 bazických bodů na 3,75 až 4,00 %, což bylo první zvýšení od roku 2023. Inflace v USA totiž zůstává zvýšená a vyšší sazby by měly urychlit její návrat k dvouprocentnímu cíli. Aktualizované projekce ukázaly, že 16 z 18 představitelů Fedu počítá s možností alespoň jednoho dalšího zvýšení o 25 bazických bodů do konce roku a čtyři z nich se dvěma.</w:t>
       </w:r>
     </w:p>
     <w:p>
@@ -431,7 +431,7 @@
         <w:rPr>
           <w:lang w:val="cs-CZ"/>
         </w:rPr>
-        <w:t xml:space="preserve">Podle zápisu ze zářijového zasedání považovala většina představitelů Fedu další zvýšení sazeb do konce roku za pravděpodobně vhodné. Zdůraznili však, že ke každému zasedání přistupují otevřeně a další rozhodnutí budou záviset na nových datech. Inflace podle nich zůstává zvýšená, trh práce se blíží plné zaměstnanosti a ekonomická aktivita roste solidním tempem. Téměř všichni účastníci vidí rizika pro inflaci vychýlená směrem nahoru, zatímco rizika pro trh práce se podle nich zmenšila. O sazbách Fed znovu rozhodne 28. října.</w:t>
+        <w:t xml:space="preserve">Další zvýšení sazeb do konce roku je proto poměrně pravděpodobné, přiklání se k němu většina představitelů Fedu. O dalším kroku ale rozhodnou až nová data. Inflace zůstává zvýšená, trh práce se blíží plné zaměstnanosti a ekonomika roste solidním tempem. Rizika pro inflaci jsou vychýlená spíše nahoru, zatímco rizika pro trh práce se zmenšila. O sazbách Fed znovu rozhodne 28. října.</w:t>
       </w:r>
     </w:p>
     <w:p>

</xml_diff>